<commit_message>
feat(ref): WO-REF01-060-B8-WAVE2-VISUAL-REPAIR-005-PHASE2-CANONICAL-006 — C031/C043/C044 정규 교체
Phase 2 정식 교체: C031/C043/C044 JSON·PDF·DOCX 9건 원자적 교체,
C1310 음성 테스트 합성 픽스처 이전, C1310 양성 3건 추가, C1309 레이블 단언 3건 갱신.

변경 요약:
- C031 S01.F06/F07, S04 text_flow 추가 / C043 S01.F05 / C044 S01.F01/F04 레이블 교정
- 경계 충돌: C031 8→0, C043 4→0, C044 7→0
- 회귀: 385 passed FAIL=0 (이전 382 + 신규 C1310_11/12/13)
- QA-004 14/14 전수 PASS
- BASE HEAD: 448c6f37

Co-Authored-By: Claude Sonnet 4.6 <noreply@anthropic.com>
</commit_message>
<xml_diff>
--- a/docs/reference-forms/output/TAI-FORM-C031-blank.docx
+++ b/docs/reference-forms/output/TAI-FORM-C031-blank.docx
@@ -284,7 +284,7 @@
                 <w:sz w:val="20"/>
                 <w:szCs w:val="20"/>
               </w:rPr>
-              <w:t xml:space="preserve">사용 교육자료(명칭·버전): </w:t>
+              <w:t xml:space="preserve">교육자료·버전: </w:t>
             </w:r>
           </w:p>
         </w:tc>
@@ -321,7 +321,7 @@
                 <w:sz w:val="20"/>
                 <w:szCs w:val="20"/>
               </w:rPr>
-              <w:t xml:space="preserve">출석 증빙 종류·보관 위치: </w:t>
+              <w:t xml:space="preserve">출석증빙·보관: </w:t>
             </w:r>
           </w:p>
         </w:tc>
@@ -2306,6 +2306,28 @@
         </w:tc>
       </w:tr>
     </w:tbl>
+    <w:p>
+      <w:pPr>
+        <w:spacing w:after="80" w:before="80"/>
+      </w:pPr>
+      <w:r>
+        <w:t xml:space="preserve"/>
+      </w:r>
+    </w:p>
+    <w:p>
+      <w:pPr>
+        <w:spacing w:after="40" w:before="40"/>
+        <w:jc w:val="left"/>
+      </w:pPr>
+      <w:r>
+        <w:rPr>
+          <w:rFonts w:ascii="NanumGothic" w:cs="NanumGothic" w:eastAsia="NanumGothic" w:hAnsi="NanumGothic"/>
+          <w:sz w:val="20"/>
+          <w:szCs w:val="20"/>
+        </w:rPr>
+        <w:t xml:space="preserve">【작성 안내】 출석증빙·보관란에는 출석 증빙의 종류(예: 참석자 서명부)와 실제 보관 위치를 함께 기재하십시오.</w:t>
+      </w:r>
+    </w:p>
     <w:p>
       <w:pPr>
         <w:spacing w:after="80" w:before="80"/>

</xml_diff>